<commit_message>
refactor: soften bold claims and adjust wording for conservatism in text
</commit_message>
<xml_diff>
--- a/Глухов_предзащита_доклад.docx
+++ b/Глухов_предзащита_доклад.docx
@@ -197,7 +197,7 @@
           <w:szCs w:val="28"/>
           <w:lang w:val="ru-RU" w:eastAsia="ru-RU"/>
         </w:rPr>
-        <w:t xml:space="preserve">Республика Татарстан представляет собой показательный и во многом самостоятельный случай. Регион располагает разветвлённой музейной сетью и значимым историко-культурным наследием, включая крупные музеи-заповедники, связанные с памятниками федерального и всемирного значения. Одновременно Татарстан с начала 2000-х годов последовательно проводил собственную политику информационного развития — программы «Электронный Татарстан» и «Цифровой Татарстан». Особый конституционно-правовой статус республики, равноправие русского и татарского языков и деятельность Центра информационных технологий Республики Татарстан создали уникальное сочетание условий, не имеющее прямых аналогов в других регионах. Наконец, значительная часть документов, связанных с внедрением КАМИС, созданием региональных каталогов и виртуальных ресурсов, до сих пор не введена в научный оборот, а пандемия COVID-19 наглядно показала, что готовность музеев к дистанционной работе прямо зависит от ранее накопленной информационной инфраструктуры. Всё это определяет научную и практическую актуальность темы.</w:t>
+        <w:t xml:space="preserve">Республика Татарстан представляет собой показательный и во многом самостоятельный случай. Регион располагает разветвлённой музейной сетью и значимым историко-культурным наследием, включая крупные музеи-заповедники, связанные с памятниками федерального и всемирного значения. Одновременно Татарстан с начала 2000-х годов последовательно проводил собственную политику информационного развития — программы «Электронный Татарстан» и «Цифровой Татарстан». Особый конституционно-правовой статус республики, равноправие русского и татарского языков и деятельность Центра информационных технологий Республики Татарстан создали особое сочетание условий, отличающее республику от многих других регионов. Наконец, значительная часть документов, связанных с внедрением КАМИС, созданием региональных каталогов и виртуальных ресурсов, до сих пор не введена в научный оборот, а пандемия COVID-19 показала, что готовность музеев к дистанционной работе прямо зависит от ранее накопленной информационной инфраструктуры. Всё это определяет научную и практическую актуальность темы.</w:t>
       </w:r>
     </w:p>
     <w:p>
@@ -264,7 +264,7 @@
           <w:szCs w:val="28"/>
           <w:lang w:val="ru-RU" w:eastAsia="ru-RU"/>
         </w:rPr>
-        <w:t xml:space="preserve">Вместе с тем анализ литературы убедительно показывает: при наличии значительного массива работ по смежным темам специализированного исследования, посвящённого информатизации музеев Республики Татарстан как целостному историческому процессу, до сих пор не создано. Отдельные сюжеты освещались фрагментарно — в публикациях практиков, отчётах учреждений и ведомственных материалах, не образующих комплексной историко-аналитической реконструкции. Именно эта лакуна и составляет научную проблему диссертации.</w:t>
+        <w:t xml:space="preserve">Вместе с тем анализ литературы показывает: при наличии значительного массива работ по смежным темам специализированного исследования, посвящённого информатизации музеев Республики Татарстан как целостному историческому процессу, до сих пор не создано. Отдельные сюжеты освещались фрагментарно — в публикациях практиков, отчётах учреждений и ведомственных материалах, не образующих комплексной историко-аналитической реконструкции. Именно эта лакуна и составляет научную проблему диссертации.</w:t>
       </w:r>
     </w:p>
     <w:p>
@@ -421,7 +421,7 @@
           <w:szCs w:val="28"/>
           <w:lang w:val="ru-RU" w:eastAsia="ru-RU"/>
         </w:rPr>
-        <w:t xml:space="preserve">Достоверность результатов обеспечена широкой и репрезентативной источниковой базой, объединяющей шесть групп источников. Это, во-первых, нормативные и программные документы федерального и регионального уровня; во-вторых, делопроизводственные и архивные материалы музеев, Министерства культуры РТ и ЦИТ РТ — акты внедрения КАМИС, годовые отчёты, документы о централизованном хранении баз данных; в-третьих, материалы профессиональной периодики и конференций; в-четвёртых, статистические материалы, включая формы федерального статистического наблюдения; в-пятых, материалы устной истории — интервью с сотрудниками музеев, Министерства культуры и ЦИТ РТ; в-шестых, техническая документация информационных систем, включая руководства пользователя КАМИС.</w:t>
+        <w:t xml:space="preserve">Достоверность результатов обеспечена широкой источниковой базой, объединяющей шесть групп источников. Это, во-первых, нормативные и программные документы федерального и регионального уровня; во-вторых, делопроизводственные и архивные материалы музеев, Министерства культуры РТ и ЦИТ РТ — акты внедрения КАМИС, годовые отчёты, документы о централизованном хранении баз данных; в-третьих, материалы профессиональной периодики и конференций; в-четвёртых, статистические материалы, включая формы федерального статистического наблюдения; в-пятых, материалы устной истории — интервью с сотрудниками музеев, Министерства культуры и ЦИТ РТ; в-шестых, техническая документация информационных систем, включая руководства пользователя КАМИС.</w:t>
       </w:r>
     </w:p>
     <w:p>
@@ -488,7 +488,7 @@
           <w:szCs w:val="28"/>
           <w:lang w:val="ru-RU" w:eastAsia="ru-RU"/>
         </w:rPr>
-        <w:t xml:space="preserve">Научная новизна исследования состоит в том, что история информатизации музейной сети Республики Татарстан впервые рассматривается как самостоятельный исторический процесс. Впервые предложена авторская пятиэтапная периодизация; впервые введён в научный оборот и систематизирован корпус архивных и устно-исторических источников; впервые выявлены и описаны региональные особенности татарстанской модели — двуязычный портал, координирующая роль ЦИТ РТ, централизованная серверная инфраструктура и раннее, по сравнению со многими регионами, распространение КАМИС.</w:t>
+        <w:t xml:space="preserve">Научная новизна исследования состоит в том, что история информатизации музейной сети Республики Татарстан рассматривается как самостоятельный исторический процесс. Предложена авторская пятиэтапная периодизация; введён в научный оборот и систематизирован корпус архивных и устно-исторических источников; выявлены и описаны региональные особенности татарстанской модели — двуязычный портал, координирующая роль ЦИТ РТ, централизованная серверная инфраструктура и сравнительно раннее распространение КАМИС.</w:t>
       </w:r>
     </w:p>
     <w:p>
@@ -510,7 +510,7 @@
           <w:szCs w:val="28"/>
           <w:lang w:val="ru-RU" w:eastAsia="ru-RU"/>
         </w:rPr>
-        <w:t xml:space="preserve">Отдельно остановлюсь на понятийном аппарате, поскольку он имеет принципиальное значение для всей работы. В литературе понятия «информатизация», «цифровизация» и «оцифровка» нередко употребляются как синонимы, что приводит к смешению разнопорядковых явлений. В диссертации они последовательно разграничены применительно к музейной практике: оцифровка понимается как перевод конкретных объектов и документов в электронную форму; информатизация — как более широкий, системный процесс внедрения вычислительной техники, баз данных и регламентов, охватывающий организацию работы учреждения; цифровизация — как качественное преобразование самих профессиональных и коммуникационных практик. Такое разграничение носит не формальный, а содержательный характер и служит рабочим инструментом периодизации и анализа.</w:t>
+        <w:t xml:space="preserve">Отдельно остановлюсь на понятийном аппарате, поскольку он имеет существенное значение для всей работы. В литературе понятия «информатизация», «цифровизация» и «оцифровка» нередко употребляются как синонимы, что приводит к смешению разнопорядковых явлений. В диссертации они последовательно разграничены применительно к музейной практике: оцифровка понимается как перевод конкретных объектов и документов в электронную форму; информатизация — как более широкий, системный процесс внедрения вычислительной техники, баз данных и регламентов, охватывающий организацию работы учреждения; цифровизация — как качественное преобразование самих профессиональных и коммуникационных практик. Такое разграничение носит не формальный, а содержательный характер и служит рабочим инструментом периодизации и анализа.</w:t>
       </w:r>
     </w:p>
     <w:p>
@@ -644,7 +644,7 @@
           <w:szCs w:val="28"/>
           <w:lang w:val="ru-RU" w:eastAsia="ru-RU"/>
         </w:rPr>
-        <w:t xml:space="preserve">Второе. Авторская периодизация выделяет пять этапов. Первый этап (начало 1990-х — 2001 год) — предпосылки и начальная, несистемная компьютеризация: появление первых персональных компьютеров и локальных электронных баз при отсутствии единых стандартов. Второй (2002–2012 годы) — формирование системной инфраструктуры на базе КАМИС и региональной координации; к этому этапу относится, в частности, региональный проект 2008 года, в рамках которого системой были дополнительно оснащены ещё несколько музейных учреждений. Третий (2013–2016 годы) — переход к единому информационному пространству: создание Объединённого электронного каталога в 2014 году и запуск портала «Виртуальный музей Республики Татарстан» в 2015 году. Четвёртый (2017–2019 годы) — углубление интеграции в Государственный каталог Музейного фонда Российской Федерации. Пятый (с 2020 года) — ускорение дистанционных форм работы и цифровых коммуникаций. Принципиально, что границы этапов проведены не произвольно, а по смене нормативных условий, технологической базы и институциональной организации, и каждый этап подтверждается самостоятельным комплексом источников.</w:t>
+        <w:t xml:space="preserve">Второе. Авторская периодизация выделяет пять этапов. Первый этап (начало 1990-х — 2001 год) — предпосылки и начальная, несистемная компьютеризация: появление первых персональных компьютеров и локальных электронных баз при отсутствии единых стандартов. Второй (2002–2012 годы) — формирование системной инфраструктуры на базе КАМИС и региональной координации; к этому этапу относится, в частности, региональный проект 2008 года, в рамках которого системой были дополнительно оснащены ещё несколько музейных учреждений. Третий (2013–2016 годы) — переход к единому информационному пространству: создание Объединённого электронного каталога в 2014 году и запуск портала «Виртуальный музей Республики Татарстан» в 2015 году. Четвёртый (2017–2019 годы) — углубление интеграции в Государственный каталог Музейного фонда Российской Федерации. Пятый (с 2020 года) — ускорение дистанционных форм работы и цифровых коммуникаций. Существенно, что границы этапов проведены не произвольно, а по смене нормативных условий, технологической базы и институциональной организации, и каждый этап подтверждается самостоятельным комплексом источников.</w:t>
       </w:r>
     </w:p>
     <w:p>
@@ -666,7 +666,7 @@
           <w:szCs w:val="28"/>
           <w:lang w:val="ru-RU" w:eastAsia="ru-RU"/>
         </w:rPr>
-        <w:t xml:space="preserve">Третье. Внедрение системы КАМИС-2000 в Национальном музее Республики Татарстан в 2002 году стало отправной точкой системной информатизации. Именно здесь сложилась технологическая и организационная модель учёта, научной обработки и документирования фондов, которая впоследствии была распространена на другие учреждения республики. Показательна и масштабность накопленного результата: по данным мониторинга 2015 года, в базах КАМИС тридцати музеев было учтено порядка 420 тысяч предметов, причём только Национальный музей обеспечил ввод более 250 тысяч единиц хранения. Это убедительно подтверждает роль учреждения как методического и технологического центра республиканской музейной сети.</w:t>
+        <w:t xml:space="preserve">Третье. Внедрение системы КАМИС-2000 в Национальном музее Республики Татарстан в 2002 году стало отправной точкой системной информатизации. Именно здесь сложилась технологическая и организационная модель учёта, научной обработки и документирования фондов, которая впоследствии была распространена на другие учреждения республики. Показательна и масштабность накопленного результата: по данным мониторинга 2015 года, в базах КАМИС тридцати музеев было учтено порядка 420 тысяч предметов, причём только Национальный музей обеспечил ввод более 250 тысяч единиц хранения. Это свидетельствует о роли учреждения как методического и технологического центра республиканской музейной сети.</w:t>
       </w:r>
     </w:p>
     <w:p>
@@ -710,7 +710,7 @@
           <w:szCs w:val="28"/>
           <w:lang w:val="ru-RU" w:eastAsia="ru-RU"/>
         </w:rPr>
-        <w:t xml:space="preserve">Пятое. Создание Объединённого электронного каталога и запуск портала «Виртуальный музей Республики Татарстан» обозначили качественный переход от внутримузейной автоматизации к единому региональному информационному пространству. Динамика охвата наглядна: если к 2015 году системой КАМИС было оснащено порядка тридцати музеев, что составляло около половины учреждений республики, то к 2016 году их число возросло до шестидесяти двух, охватив большинство государственных и муниципальных музеев. При этом двуязычная, русско-татарская модель портала была прямо связана с нормами республиканского языкового законодательства и отражает специфику региона как самостоятельную историческую черту его модели информатизации.</w:t>
+        <w:t xml:space="preserve">Пятое. Создание Объединённого электронного каталога и запуск портала «Виртуальный музей Республики Татарстан» обозначили качественный переход от внутримузейной автоматизации к единому региональному информационному пространству. Динамика охвата заметна: если к 2015 году системой КАМИС было оснащено порядка тридцати музеев, что составляло около половины учреждений республики, то к 2016 году их число возросло до шестидесяти двух, охватив большинство государственных и муниципальных музеев. При этом двуязычная, русско-татарская модель портала была прямо связана с нормами республиканского языкового законодательства и отражает специфику региона как самостоятельную историческую черту его модели информатизации.</w:t>
       </w:r>
     </w:p>
     <w:p>
@@ -754,7 +754,7 @@
           <w:szCs w:val="28"/>
           <w:lang w:val="ru-RU" w:eastAsia="ru-RU"/>
         </w:rPr>
-        <w:t xml:space="preserve">Седьмое. Татарстанская модель информатизации музеев характеризуется специфическим и устойчивым сочетанием развитой региональной ИТ-инфраструктуры, двуязычной культурной политики и постоянной организационной координации. Именно это сочетание отличает татарстанский опыт от практики многих других субъектов Федерации и составляет его самостоятельное историческое значение.</w:t>
+        <w:t xml:space="preserve">Седьмое. Татарстанская модель информатизации музеев характеризуется не абсолютным превосходством над другими регионами, а специфическим сочетанием развитой региональной ИТ-инфраструктуры, двуязычной культурной политики и устойчивой межведомственной координации. Именно это сочетание отличает татарстанский опыт от практики многих других субъектов Федерации и составляет его самостоятельное историческое значение.</w:t>
       </w:r>
     </w:p>
     <w:p>
@@ -799,7 +799,7 @@
           <w:szCs w:val="28"/>
           <w:lang w:val="ru-RU" w:eastAsia="ru-RU"/>
         </w:rPr>
-        <w:t xml:space="preserve">Совокупность установленных фактов позволяет говорить о ряде значимых результатов. Информатизация музейной сферы республики приобрела многоуровневый характер: она охватила не только электронный учёт и каталогизацию, но и интеграцию с федеральными ресурсами, публичные интернет-представительства, виртуальные музейные продукты и новые каналы коммуникации с аудиторией. Национальный музей Республики Татарстан стал, в частности, одним из первых известных кейсов внедрения мессенджер-технологий — телеграм-ботов — в практику информационного сопровождения посетителей. Вместе с тем исследование честно фиксирует и устойчивые ограничения процесса: неравномерность ресурсного обеспечения, дефицит кадров, различия в технической оснащённости крупных государственных и малых муниципальных музеев, а также зависимость части учреждений от внешней методической поддержки. Такой сбалансированный взгляд, не сводящийся к перечислению достижений, повышает научную достоверность выводов.</w:t>
+        <w:t xml:space="preserve">Совокупность установленных фактов позволяет говорить о ряде значимых результатов. Информатизация музейной сферы республики приобрела многоуровневый характер: она охватила не только электронный учёт и каталогизацию, но и интеграцию с федеральными ресурсами, публичные интернет-представительства, виртуальные музейные продукты и новые каналы коммуникации с аудиторией. Национальный музей Республики Татарстан стал, в частности, показательным примером внедрения мессенджер-технологий — телеграм-ботов — в практику информационного сопровождения посетителей. Вместе с тем исследование честно фиксирует и устойчивые ограничения процесса: неравномерность ресурсного обеспечения, дефицит кадров, различия в технической оснащённости крупных государственных и малых муниципальных музеев, а также зависимость части учреждений от внешней методической поддержки. Такой сбалансированный взгляд, не сводящийся к перечислению достижений, повышает научную достоверность выводов.</w:t>
       </w:r>
     </w:p>
     <w:p>
@@ -934,7 +934,7 @@
           <w:szCs w:val="28"/>
           <w:lang w:val="ru-RU" w:eastAsia="ru-RU"/>
         </w:rPr>
-        <w:t xml:space="preserve">Таким образом, в диссертации впервые осуществлена целостная историческая реконструкция информатизации музеев Республики Татарстан с начала 1990-х годов по 2026 год. Показано, что этот процесс представлял собой длительное и неоднородное, но внутренне связное явление, в котором сочетались технические нововведения, административные решения и профессиональные инициативы музейного сообщества, и который должен рассматриваться как важная часть истории региональной культурной политики и музейного дела конца XX — первой четверти XXI века. Полученные выводы обоснованы репрезентативной источниковой базой и подтверждаются совокупностью введённых в научный оборот документов, статистических данных и материалов устной истории.</w:t>
+        <w:t xml:space="preserve">Таким образом, в диссертации осуществлена целостная историческая реконструкция информатизации музеев Республики Татарстан с начала 1990-х годов по 2026 год. Показано, что этот процесс представлял собой длительное и неоднородное, но внутренне связное явление, в котором сочетались технические нововведения, административные решения и профессиональные инициативы музейного сообщества, и который должен рассматриваться как важная часть истории региональной культурной политики и музейного дела конца XX — первой четверти XXI века. Полученные выводы обоснованы широкой источниковой базой и подтверждаются совокупностью введённых в научный оборот документов, статистических данных и материалов устной истории.</w:t>
       </w:r>
     </w:p>
     <w:p>

</xml_diff>